<commit_message>
Update report with saved version of Word doc
Moves the saved Channel_Breakout_Report.docx here from the etfs branch,
where it was committed by mistake (5dd0d19, reverted there in 0f77f1f).

Co-Authored-By: Claude Opus 5.5 <noreply@anthropic.com>
</commit_message>
<xml_diff>
--- a/momentum_reversal/Channel_Breakout_Report.docx
+++ b/momentum_reversal/Channel_Breakout_Report.docx
@@ -41,7 +41,21 @@
           <w:sz w:val="24"/>
           <w:szCs w:val="24"/>
         </w:rPr>
-        <w:t>Author: [your name]</w:t>
+        <w:t xml:space="preserve">Author: </w:t>
+      </w:r>
+      <w:r>
+        <w:rPr>
+          <w:sz w:val="24"/>
+          <w:szCs w:val="24"/>
+        </w:rPr>
+        <w:t>Aidan Yeoh</w:t>
+      </w:r>
+      <w:r>
+        <w:rPr>
+          <w:sz w:val="24"/>
+          <w:szCs w:val="24"/>
+        </w:rPr>
+        <w:t xml:space="preserve"> </w:t>
       </w:r>
     </w:p>
     <w:p>
@@ -53,7 +67,14 @@
           <w:sz w:val="24"/>
           <w:szCs w:val="24"/>
         </w:rPr>
-        <w:t>Date: [date]</w:t>
+        <w:t xml:space="preserve">Date: </w:t>
+      </w:r>
+      <w:r>
+        <w:rPr>
+          <w:sz w:val="24"/>
+          <w:szCs w:val="24"/>
+        </w:rPr>
+        <w:t>14/10/2026</w:t>
       </w:r>
     </w:p>
     <w:p>
@@ -69,6 +90,7 @@
           <w:sz w:val="32"/>
           <w:szCs w:val="32"/>
         </w:rPr>
+        <w:lastRenderedPageBreak/>
         <w:t>Contents</w:t>
       </w:r>
     </w:p>
@@ -77,7 +99,6 @@
         <w:alias w:val="Contents"/>
         <w:id w:val="1016036658"/>
       </w:sdtPr>
-      <w:sdtEndPr/>
       <w:sdtContent>
         <w:p>
           <w:pPr>
@@ -2864,6 +2885,7 @@
       </w:pPr>
       <w:bookmarkStart w:id="0" w:name="_Toc242891858"/>
       <w:r>
+        <w:lastRenderedPageBreak/>
         <w:t>1. Executive Summary</w:t>
       </w:r>
       <w:bookmarkEnd w:id="0"/>
@@ -3096,6 +3118,7 @@
       </w:pPr>
       <w:bookmarkStart w:id="11" w:name="_Toc242891869"/>
       <w:r>
+        <w:lastRenderedPageBreak/>
         <w:t>4.2 Portfolio construction and weighting</w:t>
       </w:r>
       <w:bookmarkEnd w:id="11"/>
@@ -4170,6 +4193,7 @@
           <w:iCs/>
           <w:color w:val="7F7F7F"/>
         </w:rPr>
+        <w:lastRenderedPageBreak/>
         <w:t>[Which exit length M was chosen and why (in-sample only). Source: notebook 02, section 5; results/03_exit_grid_IS.csv.]</w:t>
       </w:r>
     </w:p>
@@ -6922,6 +6946,7 @@
       </w:pPr>
       <w:bookmarkStart w:id="22" w:name="_Toc242891880"/>
       <w:r>
+        <w:lastRenderedPageBreak/>
         <w:t>5.6 Long and short legs by year</w:t>
       </w:r>
       <w:bookmarkEnd w:id="22"/>
@@ -7816,6 +7841,7 @@
           <w:iCs/>
           <w:color w:val="7F7F7F"/>
         </w:rPr>
+        <w:lastRenderedPageBreak/>
         <w:t>Insert figure: results/beta_hedge.png</w:t>
       </w:r>
     </w:p>
@@ -9242,6 +9268,7 @@
       </w:pPr>
       <w:bookmarkStart w:id="37" w:name="_Toc242891895"/>
       <w:r>
+        <w:lastRenderedPageBreak/>
         <w:t>9. Intraday Study: Bollinger Bands on One-Minute Data</w:t>
       </w:r>
       <w:bookmarkEnd w:id="37"/>
@@ -9390,6 +9417,7 @@
       </w:pPr>
       <w:bookmarkStart w:id="43" w:name="_Toc242891901"/>
       <w:r>
+        <w:lastRenderedPageBreak/>
         <w:t>Appendix A. Notebook and Results Map</w:t>
       </w:r>
       <w:bookmarkEnd w:id="43"/>

</xml_diff>